<commit_message>
Reorganize classification and regression examples
</commit_message>
<xml_diff>
--- a/examples/classification/doc/README.docx
+++ b/examples/classification/doc/README.docx
@@ -2,7 +2,7 @@
 <file path=word/document.xml><?xml version="1.0" encoding="utf-8"?>
 <w:document xmlns:w="http://schemas.openxmlformats.org/wordprocessingml/2006/main" xmlns:m="http://schemas.openxmlformats.org/officeDocument/2006/math" xmlns:r="http://schemas.openxmlformats.org/officeDocument/2006/relationships" xmlns:o="urn:schemas-microsoft-com:office:office" xmlns:v="urn:schemas-microsoft-com:vml" xmlns:w10="urn:schemas-microsoft-com:office:word" xmlns:a="http://schemas.openxmlformats.org/drawingml/2006/main" xmlns:pic="http://schemas.openxmlformats.org/drawingml/2006/picture" xmlns:wp="http://schemas.openxmlformats.org/drawingml/2006/wordprocessingDrawing">
   <w:body>
-    <w:bookmarkStart w:id="16" w:name="classification-examples"/>
+    <w:bookmarkStart w:id="17" w:name="classification-examples"/>
     <w:p>
       <w:pPr>
         <w:pStyle w:val="Heading1"/>
@@ -70,6 +70,7 @@
     </w:p>
     <w:p>
       <w:pPr>
+        <w:pStyle w:val="Compact"/>
         <w:numPr>
           <w:ilvl w:val="0"/>
           <w:numId w:val="1001"/>
@@ -90,6 +91,7 @@
     </w:p>
     <w:p>
       <w:pPr>
+        <w:pStyle w:val="Compact"/>
         <w:numPr>
           <w:ilvl w:val="0"/>
           <w:numId w:val="1001"/>
@@ -110,6 +112,7 @@
     </w:p>
     <w:p>
       <w:pPr>
+        <w:pStyle w:val="Compact"/>
         <w:numPr>
           <w:ilvl w:val="0"/>
           <w:numId w:val="1001"/>
@@ -130,6 +133,7 @@
     </w:p>
     <w:p>
       <w:pPr>
+        <w:pStyle w:val="Compact"/>
         <w:numPr>
           <w:ilvl w:val="0"/>
           <w:numId w:val="1001"/>
@@ -162,6 +166,7 @@
     </w:p>
     <w:p>
       <w:pPr>
+        <w:pStyle w:val="Compact"/>
         <w:numPr>
           <w:ilvl w:val="0"/>
           <w:numId w:val="1001"/>
@@ -182,17 +187,26 @@
     </w:p>
     <w:p>
       <w:pPr>
-        <w:numPr>
-          <w:ilvl w:val="0"/>
-          <w:numId w:val="1001"/>
-        </w:numPr>
-      </w:pPr>
+        <w:pStyle w:val="FirstParagraph"/>
+      </w:pPr>
+      <w:r>
+        <w:t xml:space="preserve">Scikit-learn</w:t>
+      </w:r>
+      <w:r>
+        <w:t xml:space="preserve"> </w:t>
+      </w:r>
+      <w:r>
+        <w:t xml:space="preserve">-</w:t>
+      </w:r>
+      <w:r>
+        <w:t xml:space="preserve"> </w:t>
+      </w:r>
       <w:hyperlink r:id="rId9">
         <w:r>
           <w:rPr>
             <w:rStyle w:val="Hyperlink"/>
           </w:rPr>
-          <w:t xml:space="preserve">skcla_knn.md</w:t>
+          <w:t xml:space="preserve">01_skcla_knn.md</w:t>
         </w:r>
       </w:hyperlink>
       <w:r>
@@ -201,20 +215,21 @@
       <w:r>
         <w:t xml:space="preserve">— K-Nearest Neighbors: predicts by majority vote among the k nearest neighbors.</w:t>
       </w:r>
-    </w:p>
-    <w:p>
-      <w:pPr>
-        <w:numPr>
-          <w:ilvl w:val="0"/>
-          <w:numId w:val="1001"/>
-        </w:numPr>
-      </w:pPr>
+      <w:r>
+        <w:t xml:space="preserve"> </w:t>
+      </w:r>
+      <w:r>
+        <w:t xml:space="preserve">-</w:t>
+      </w:r>
+      <w:r>
+        <w:t xml:space="preserve"> </w:t>
+      </w:r>
       <w:hyperlink r:id="rId10">
         <w:r>
           <w:rPr>
             <w:rStyle w:val="Hyperlink"/>
           </w:rPr>
-          <w:t xml:space="preserve">skcla_nb.md</w:t>
+          <w:t xml:space="preserve">02_skcla_nb.md</w:t>
         </w:r>
       </w:hyperlink>
       <w:r>
@@ -223,20 +238,21 @@
       <w:r>
         <w:t xml:space="preserve">— Naive Bayes: applies Bayes’ rule with a conditional independence assumption among features.</w:t>
       </w:r>
-    </w:p>
-    <w:p>
-      <w:pPr>
-        <w:numPr>
-          <w:ilvl w:val="0"/>
-          <w:numId w:val="1001"/>
-        </w:numPr>
-      </w:pPr>
+      <w:r>
+        <w:t xml:space="preserve"> </w:t>
+      </w:r>
+      <w:r>
+        <w:t xml:space="preserve">-</w:t>
+      </w:r>
+      <w:r>
+        <w:t xml:space="preserve"> </w:t>
+      </w:r>
       <w:hyperlink r:id="rId11">
         <w:r>
           <w:rPr>
             <w:rStyle w:val="Hyperlink"/>
           </w:rPr>
-          <w:t xml:space="preserve">skcla_svc.md</w:t>
+          <w:t xml:space="preserve">03_skcla_svc.md</w:t>
         </w:r>
       </w:hyperlink>
       <w:r>
@@ -245,20 +261,21 @@
       <w:r>
         <w:t xml:space="preserve">— SVM (Support Vector Machine): maximizes margin; kernels enable nonlinear decision boundaries.</w:t>
       </w:r>
-    </w:p>
-    <w:p>
-      <w:pPr>
-        <w:numPr>
-          <w:ilvl w:val="0"/>
-          <w:numId w:val="1001"/>
-        </w:numPr>
-      </w:pPr>
+      <w:r>
+        <w:t xml:space="preserve"> </w:t>
+      </w:r>
+      <w:r>
+        <w:t xml:space="preserve">-</w:t>
+      </w:r>
+      <w:r>
+        <w:t xml:space="preserve"> </w:t>
+      </w:r>
       <w:hyperlink r:id="rId12">
         <w:r>
           <w:rPr>
             <w:rStyle w:val="Hyperlink"/>
           </w:rPr>
-          <w:t xml:space="preserve">skcla_rf.md</w:t>
+          <w:t xml:space="preserve">04_skcla_rf.md</w:t>
         </w:r>
       </w:hyperlink>
       <w:r>
@@ -267,20 +284,21 @@
       <w:r>
         <w:t xml:space="preserve">— Random Forest: ensemble of decision trees with majority voting; robust via bagging and feature randomness.</w:t>
       </w:r>
-    </w:p>
-    <w:p>
-      <w:pPr>
-        <w:numPr>
-          <w:ilvl w:val="0"/>
-          <w:numId w:val="1001"/>
-        </w:numPr>
-      </w:pPr>
+      <w:r>
+        <w:t xml:space="preserve"> </w:t>
+      </w:r>
+      <w:r>
+        <w:t xml:space="preserve">-</w:t>
+      </w:r>
+      <w:r>
+        <w:t xml:space="preserve"> </w:t>
+      </w:r>
       <w:hyperlink r:id="rId13">
         <w:r>
           <w:rPr>
             <w:rStyle w:val="Hyperlink"/>
           </w:rPr>
-          <w:t xml:space="preserve">skcla_gb.md</w:t>
+          <w:t xml:space="preserve">05_skcla_gb.md</w:t>
         </w:r>
       </w:hyperlink>
       <w:r>
@@ -289,20 +307,21 @@
       <w:r>
         <w:t xml:space="preserve">— Gradient Boosting: additive ensemble of trees fit to gradients of the loss.</w:t>
       </w:r>
-    </w:p>
-    <w:p>
-      <w:pPr>
-        <w:numPr>
-          <w:ilvl w:val="0"/>
-          <w:numId w:val="1001"/>
-        </w:numPr>
-      </w:pPr>
+      <w:r>
+        <w:t xml:space="preserve"> </w:t>
+      </w:r>
+      <w:r>
+        <w:t xml:space="preserve">-</w:t>
+      </w:r>
+      <w:r>
+        <w:t xml:space="preserve"> </w:t>
+      </w:r>
       <w:hyperlink r:id="rId14">
         <w:r>
           <w:rPr>
             <w:rStyle w:val="Hyperlink"/>
           </w:rPr>
-          <w:t xml:space="preserve">skcla_mlp.md</w:t>
+          <w:t xml:space="preserve">06_skcla_mlp.md</w:t>
         </w:r>
       </w:hyperlink>
       <w:r>
@@ -314,17 +333,26 @@
     </w:p>
     <w:p>
       <w:pPr>
-        <w:numPr>
-          <w:ilvl w:val="0"/>
-          <w:numId w:val="1001"/>
-        </w:numPr>
-      </w:pPr>
+        <w:pStyle w:val="BodyText"/>
+      </w:pPr>
+      <w:r>
+        <w:t xml:space="preserve">PyTorch</w:t>
+      </w:r>
+      <w:r>
+        <w:t xml:space="preserve"> </w:t>
+      </w:r>
+      <w:r>
+        <w:t xml:space="preserve">-</w:t>
+      </w:r>
+      <w:r>
+        <w:t xml:space="preserve"> </w:t>
+      </w:r>
       <w:hyperlink r:id="rId15">
         <w:r>
           <w:rPr>
             <w:rStyle w:val="Hyperlink"/>
           </w:rPr>
-          <w:t xml:space="preserve">torch_cla_mlp.md</w:t>
+          <w:t xml:space="preserve">07_torch_cla_mlp.md</w:t>
         </w:r>
       </w:hyperlink>
       <w:r>
@@ -333,8 +361,31 @@
       <w:r>
         <w:t xml:space="preserve">— PyTorch MLP classifier: neural classification with configurable static/dynamic validation and stopping rules.</w:t>
       </w:r>
+      <w:r>
+        <w:t xml:space="preserve"> </w:t>
+      </w:r>
+      <w:r>
+        <w:t xml:space="preserve">-</w:t>
+      </w:r>
+      <w:r>
+        <w:t xml:space="preserve"> </w:t>
+      </w:r>
+      <w:hyperlink r:id="rId16">
+        <w:r>
+          <w:rPr>
+            <w:rStyle w:val="Hyperlink"/>
+          </w:rPr>
+          <w:t xml:space="preserve">08_torch_cla_mlp_dynamic_patience.md</w:t>
+        </w:r>
+      </w:hyperlink>
+      <w:r>
+        <w:t xml:space="preserve"> </w:t>
+      </w:r>
+      <w:r>
+        <w:t xml:space="preserve">— PyTorch MLP classifier with dynamic validation and patience-based early stopping.</w:t>
+      </w:r>
     </w:p>
-    <w:bookmarkEnd w:id="16"/>
+    <w:bookmarkEnd w:id="17"/>
     <w:sectPr>
       <w:footnotePr>
         <w:numRestart w:val="eachSect"/>

</xml_diff>